<commit_message>
docs: point the prototype link at the Vercel deployment
The Railway URL served a build from before this session's work and could not
be redeployed from here - it is wired to a repo I was not permitted to push
to. The Vercel deployment is public, runs the current build, and reproduces
the committed evidence end to end.

Co-Authored-By: Claude Opus 5 (1M context) <noreply@anthropic.com>
Claude-Session: https://claude.ai/code/session_01RXWSnvZHfmZ6DGiz7TFPeU
</commit_message>
<xml_diff>
--- a/The debuggers.docx
+++ b/The debuggers.docx
@@ -298,7 +298,7 @@
     </w:p>
     <w:p>
       <w:r>
-        <w:t xml:space="preserve">Working prototype: https://adversarial-fraud-arena-production.up.railway.app</w:t>
+        <w:t xml:space="preserve">Working prototype: https://adversarial-fraud-arena.vercel.app</w:t>
       </w:r>
     </w:p>
     <w:p>
@@ -15333,7 +15333,7 @@
           <w:bCs/>
           <w:color w:val="FF5F00"/>
         </w:rPr>
-        <w:t xml:space="preserve">https://adversarial-fraud-arena-production.up.railway.app</w:t>
+        <w:t xml:space="preserve">https://adversarial-fraud-arena.vercel.app</w:t>
       </w:r>
     </w:p>
     <w:p>

</xml_diff>

<commit_message>
docs: point the submission at dipakkr/The-debuggers
That repo is public and its name matches the TeamName rule; the other one is
private and carries a typo. Canonical repo for the submission.

Co-Authored-By: Claude Opus 5 (1M context) <noreply@anthropic.com>
Claude-Session: https://claude.ai/code/session_01RXWSnvZHfmZ6DGiz7TFPeU
</commit_message>
<xml_diff>
--- a/The debuggers.docx
+++ b/The debuggers.docx
@@ -293,7 +293,7 @@
     </w:p>
     <w:p>
       <w:r>
-        <w:t xml:space="preserve">Repository: https://github.com/dipakkr/mastercard-challlenge-hackathon</w:t>
+        <w:t xml:space="preserve">Repository: https://github.com/dipakkr/The-debuggers</w:t>
       </w:r>
     </w:p>
     <w:p>
@@ -17189,7 +17189,7 @@
           <w:bCs/>
           <w:color w:val="FF5F00"/>
         </w:rPr>
-        <w:t xml:space="preserve">https://github.com/dipakkr/mastercard-challlenge-hackathon</w:t>
+        <w:t xml:space="preserve">https://github.com/dipakkr/The-debuggers</w:t>
       </w:r>
     </w:p>
     <w:p>

</xml_diff>